<commit_message>
Sun shadow layer black, adjust cv maker
</commit_message>
<xml_diff>
--- a/Supporting Text/output/Kauppila_CV_formatted.docx
+++ b/Supporting Text/output/Kauppila_CV_formatted.docx
@@ -63,7 +63,7 @@
           <w:i w:val="0"/>
           <w:sz w:val="22"/>
         </w:rPr>
-        <w:t>Carnegie Mellon University (MFA, expected 2016)</w:t>
+        <w:t>Carnegie Mellon University (MFA, 2016)</w:t>
       </w:r>
     </w:p>
     <w:p>
@@ -796,49 +796,6 @@
           <w:sz w:val="22"/>
         </w:rPr>
         <w:t>Rayko Photo Center</w:t>
-      </w:r>
-    </w:p>
-    <w:p>
-      <w:pPr>
-        <w:spacing w:after="0" w:before="0"/>
-      </w:pPr>
-      <w:r>
-        <w:rPr>
-          <w:sz w:val="12"/>
-        </w:rPr>
-      </w:r>
-    </w:p>
-    <w:p>
-      <w:pPr>
-        <w:tabs>
-          <w:tab w:pos="936" w:val="left"/>
-        </w:tabs>
-        <w:spacing w:after="0"/>
-        <w:ind w:left="0"/>
-      </w:pPr>
-      <w:r>
-        <w:tab/>
-      </w:r>
-      <w:r>
-        <w:rPr>
-          <w:rFonts w:ascii="Garamond" w:hAnsi="Garamond"/>
-          <w:i w:val="0"/>
-          <w:sz w:val="22"/>
-        </w:rPr>
-        <w:t>Frank-Ratchye Fund for Art @ the Frontier Microgrant (2013)</w:t>
-      </w:r>
-    </w:p>
-    <w:p>
-      <w:pPr>
-        <w:spacing w:after="0"/>
-        <w:ind w:left="936"/>
-      </w:pPr>
-      <w:r>
-        <w:rPr>
-          <w:rFonts w:ascii="Garamond" w:hAnsi="Garamond"/>
-          <w:sz w:val="22"/>
-        </w:rPr>
-        <w:t>Carnegie Mellon University</w:t>
       </w:r>
     </w:p>
     <w:p>

</xml_diff>